<commit_message>
Use ken11balagtas@outlook.com across portfolio and all resume files.
Co-authored-by: Cursor <cursoragent@cursor.com>
</commit_message>
<xml_diff>
--- a/public/Docs/KLB_RESUME (1).docx
+++ b/public/Docs/KLB_RESUME (1).docx
@@ -73,15 +73,10 @@
           <w:color w:val="0F233D"/>
           <w:u w:val="single" w:color="0F233D"/>
         </w:rPr>
-        <w:t>ken</w:t>
-      </w:r>
-      <w:r>
-        <w:rPr>
-          <w:b/>
-          <w:color w:val="0F233D"/>
-          <w:u w:val="single" w:color="0F233D"/>
-        </w:rPr>
-        <w:t>.balagtas@outlook.com</w:t>
+        <w:t>ken11balagtas@outlook.com</w:t>
+      </w:r>
+      <w:r>
+        <w:t/>
       </w:r>
     </w:p>
     <w:p>

</xml_diff>